<commit_message>
Assignments: convert grid to two-column Name | Topic table
</commit_message>
<xml_diff>
--- a/docs/assignments/assignment_01/assigment_01_example.docx
+++ b/docs/assignments/assignment_01/assigment_01_example.docx
@@ -7,7 +7,15 @@
         <w:pStyle w:val="Title"/>
       </w:pPr>
       <w:r>
-        <w:t xml:space="preserve">Assignment 01 example</w:t>
+        <w:t xml:space="preserve">Assignment 01</w:t>
+      </w:r>
+    </w:p>
+    <w:p>
+      <w:pPr>
+        <w:pStyle w:val="Subtitle"/>
+      </w:pPr>
+      <w:r>
+        <w:t xml:space="preserve">Two-sample t-tests</w:t>
       </w:r>
     </w:p>
     <w:p>

</xml_diff>